<commit_message>
Add item 52: re-confirm stabilizer levelness after precision leveling
Co-Authored-By: Claude Fable 5 <noreply@anthropic.com>
Claude-Session: https://claude.ai/code/session_019UGpM3ZDPErkHojPtkGGy9
</commit_message>
<xml_diff>
--- a/reports/Titan2_Daily_Report_2026-08-13.docx
+++ b/reports/Titan2_Daily_Report_2026-08-13.docx
@@ -631,7 +631,7 @@
           <w:sz w:val="21"/>
           <w:szCs w:val="21"/>
         </w:rPr>
-        <w:t xml:space="preserve">The stabilizer machinist-level finding means the earlier levelness reports should be re-confirmed after the 08-14 precision leveling before any alignment sign-offs.</w:t>
+        <w:t xml:space="preserve">The stabilizer machinist-level finding means the earlier levelness reports on C-51150 and C-51175 are to be re-confirmed after the 08-14 precision leveling and the documentation re-issued before any alignment sign-offs — tracked as action item 52.</w:t>
       </w:r>
     </w:p>
     <w:p>
@@ -4307,6 +4307,123 @@
           </w:p>
         </w:tc>
       </w:tr>
+      <w:tr>
+        <w:tc>
+          <w:tcPr>
+            <w:tcW w:type="dxa" w:w="500"/>
+            <w:tcMar>
+              <w:top w:type="dxa" w:w="60"/>
+              <w:left w:type="dxa" w:w="100"/>
+              <w:bottom w:type="dxa" w:w="60"/>
+              <w:right w:type="dxa" w:w="100"/>
+            </w:tcMar>
+          </w:tcPr>
+          <w:p>
+            <w:r>
+              <w:rPr>
+                <w:b w:val="false"/>
+                <w:bCs w:val="false"/>
+                <w:color w:val="6E6A60"/>
+                <w:sz w:val="19"/>
+                <w:szCs w:val="19"/>
+              </w:rPr>
+              <w:t xml:space="preserve">52</w:t>
+            </w:r>
+          </w:p>
+        </w:tc>
+        <w:tc>
+          <w:tcPr>
+            <w:tcW w:type="dxa" w:w="5000"/>
+            <w:tcMar>
+              <w:top w:type="dxa" w:w="60"/>
+              <w:left w:type="dxa" w:w="100"/>
+              <w:bottom w:type="dxa" w:w="60"/>
+              <w:right w:type="dxa" w:w="100"/>
+            </w:tcMar>
+          </w:tcPr>
+          <w:p>
+            <w:r>
+              <w:rPr>
+                <w:b w:val="false"/>
+                <w:bCs w:val="false"/>
+                <w:color w:val="23211C"/>
+                <w:sz w:val="19"/>
+                <w:szCs w:val="19"/>
+              </w:rPr>
+              <w:t xml:space="preserve">Re-confirm the formal levelness of stabilizer compressors C-51150 and C-51175 after the 08-14 precision leveling — earlier levelness reports are superseded by the out-of-level machinist finding; re-issue the levelness documentation for all three units before any alignment sign-offs.</w:t>
+            </w:r>
+          </w:p>
+        </w:tc>
+        <w:tc>
+          <w:tcPr>
+            <w:tcW w:type="dxa" w:w="1300"/>
+            <w:tcMar>
+              <w:top w:type="dxa" w:w="60"/>
+              <w:left w:type="dxa" w:w="100"/>
+              <w:bottom w:type="dxa" w:w="60"/>
+              <w:right w:type="dxa" w:w="100"/>
+            </w:tcMar>
+          </w:tcPr>
+          <w:p>
+            <w:r>
+              <w:rPr>
+                <w:b w:val="false"/>
+                <w:bCs w:val="false"/>
+                <w:color w:val="23211C"/>
+                <w:sz w:val="19"/>
+                <w:szCs w:val="19"/>
+              </w:rPr>
+              <w:t xml:space="preserve">Equipment</w:t>
+            </w:r>
+          </w:p>
+        </w:tc>
+        <w:tc>
+          <w:tcPr>
+            <w:tcW w:type="dxa" w:w="1800"/>
+            <w:tcMar>
+              <w:top w:type="dxa" w:w="60"/>
+              <w:left w:type="dxa" w:w="100"/>
+              <w:bottom w:type="dxa" w:w="60"/>
+              <w:right w:type="dxa" w:w="100"/>
+            </w:tcMar>
+          </w:tcPr>
+          <w:p>
+            <w:r>
+              <w:rPr>
+                <w:b w:val="false"/>
+                <w:bCs w:val="false"/>
+                <w:color w:val="23211C"/>
+                <w:sz w:val="19"/>
+                <w:szCs w:val="19"/>
+              </w:rPr>
+              <w:t xml:space="preserve">Coordinator / Leveling crew</w:t>
+            </w:r>
+          </w:p>
+        </w:tc>
+        <w:tc>
+          <w:tcPr>
+            <w:tcW w:type="dxa" w:w="1200"/>
+            <w:tcMar>
+              <w:top w:type="dxa" w:w="60"/>
+              <w:left w:type="dxa" w:w="100"/>
+              <w:bottom w:type="dxa" w:w="60"/>
+              <w:right w:type="dxa" w:w="100"/>
+            </w:tcMar>
+          </w:tcPr>
+          <w:p>
+            <w:r>
+              <w:rPr>
+                <w:b/>
+                <w:bCs/>
+                <w:color w:val="9A6700"/>
+                <w:sz w:val="19"/>
+                <w:szCs w:val="19"/>
+              </w:rPr>
+              <w:t xml:space="preserve">Open</w:t>
+            </w:r>
+          </w:p>
+        </w:tc>
+      </w:tr>
     </w:tbl>
     <w:p>
       <w:pPr>
@@ -4442,7 +4559,7 @@
           <w:sz w:val="18"/>
           <w:szCs w:val="18"/>
         </w:rPr>
-        <w:t xml:space="preserve">Compiled from the last two 08-13 Plaud notes: the Titan Two project update and the action-item status meeting. Weather and crew counts were not recorded in the source notes. Register housekeeping per coordinator's direction — completed items removed: 2 (WICK manway feedback), 26 (platform decision), 28 (safety package approval), 34 (ground-grid backfill coordination), 39 (awning clearance — six inches above exhaust confirmed), 40 (heater column pour — forms now being broken). Item 48 now tracks the Bidell panel umbilical rework per the action-item review. Numbering of surviving items is unchanged; new items start at 49.</w:t>
+        <w:t xml:space="preserve">Compiled from the last two 08-13 Plaud notes: the Titan Two project update and the action-item status meeting. Weather and crew counts were not recorded in the source notes. Register housekeeping per coordinator's direction — completed items removed: 2 (WICK manway feedback), 26 (platform decision), 28 (safety package approval), 34 (ground-grid backfill coordination), 39 (awning clearance — six inches above exhaust confirmed), 40 (heater column pour — forms now being broken). Item 48 now tracks the Bidell panel umbilical rework per the action-item review. Numbering of surviving items is unchanged; new items start at 49. Item 52 reinstates stabilizer levelness verification: the reports closed under former item 19 are superseded by the out-of-level finding and must be re-issued after the 08-14 precision leveling.</w:t>
       </w:r>
     </w:p>
     <w:sectPr>

</xml_diff>